<commit_message>
v1.2.1: solo el codigo que reproduce el articulo; README, DATA y lockfile
</commit_message>
<xml_diff>
--- a/manuscript/MANUSCRIPT_v2.docx
+++ b/manuscript/MANUSCRIPT_v2.docx
@@ -135,24 +135,6 @@
       </w:r>
     </w:p>
     <w:p>
-      <w:pPr>
-        <w:pStyle w:val="BodyText"/>
-      </w:pPr>
-      <w:r>
-        <w:rPr>
-          <w:bCs/>
-          <w:b/>
-        </w:rPr>
-        <w:t xml:space="preserve">Running title:</w:t>
-      </w:r>
-      <w:r>
-        <w:t xml:space="preserve"> </w:t>
-      </w:r>
-      <w:r>
-        <w:t xml:space="preserve">Glucocorticoid signalling and the human peripheral clock</w:t>
-      </w:r>
-    </w:p>
-    <w:p>
       <w:r>
         <w:pict>
           <v:rect style="width:0;height:1.5pt" o:hralign="center" o:hrstd="t" o:hr="t"/>
@@ -201,7 +183,7 @@
         <w:pStyle w:val="Compact"/>
       </w:pPr>
       <w:r>
-        <w:t xml:space="preserve">Three hours of hyperinsulinaemic clamp reproduce three hours of morning</w:t>
+        <w:t xml:space="preserve">Hyperinsulinaemic clamp is indistinguishable from three hours of morning</w:t>
       </w:r>
     </w:p>
     <w:p>
@@ -332,7 +314,7 @@
         <w:t xml:space="preserve"> </w:t>
       </w:r>
       <w:r>
-        <w:t xml:space="preserve">estimates from four tissues, NR3C1 expression predicts the output arm of the clock (pooled ρ = 0.45,</w:t>
+        <w:t xml:space="preserve">estimates from four tissue types, NR3C1 expression predicts the output arm of the clock (pooled ρ = 0.45,</w:t>
       </w:r>
       <w:r>
         <w:t xml:space="preserve"> </w:t>
@@ -484,7 +466,7 @@
         <w:pStyle w:val="BodyText"/>
       </w:pPr>
       <w:r>
-        <w:t xml:space="preserve">Two candidates dominate. Insulin entrains peripheral oscillators in cultured cells and in rodent</w:t>
+        <w:t xml:space="preserve">Two candidates have dominated the debate. Insulin entrains peripheral oscillators in cultured cells and in rodent</w:t>
       </w:r>
       <w:r>
         <w:t xml:space="preserve"> </w:t>
@@ -516,7 +498,7 @@
         <w:pStyle w:val="BodyText"/>
       </w:pPr>
       <w:r>
-        <w:t xml:space="preserve">The obstacle is design[24,25]. Separating hormone from time of day requires a perturbation with a</w:t>
+        <w:t xml:space="preserve">The obstacle is design[13,14]. Separating hormone from time of day requires a perturbation with a</w:t>
       </w:r>
       <w:r>
         <w:t xml:space="preserve"> </w:t>
@@ -584,7 +566,7 @@
         <w:t xml:space="preserve"> </w:t>
       </w:r>
       <w:r>
-        <w:t xml:space="preserve">it across four tissues and 2,900 individuals, and show that acute insulin is indistinguishable from</w:t>
+        <w:t xml:space="preserve">it across four tissue types and 2,900 individuals, and show that acute insulin is indistinguishable from</w:t>
       </w:r>
       <w:r>
         <w:t xml:space="preserve"> </w:t>
@@ -716,25 +698,19 @@
         <w:t xml:space="preserve"> </w:t>
       </w:r>
       <w:r>
-        <w:t xml:space="preserve">single Entrez identifier carry a retired symbol[13] (Supplementary Fig. S3b,c and Supplementary Tables S14 and S15). RNA-seq series</w:t>
-      </w:r>
-      <w:r>
-        <w:t xml:space="preserve"> </w:t>
-      </w:r>
-      <w:r>
-        <w:t xml:space="preserve">were used as raw counts. Expression was centred per sample before any score was computed, because</w:t>
-      </w:r>
-      <w:r>
-        <w:t xml:space="preserve"> </w:t>
-      </w:r>
-      <w:r>
-        <w:t xml:space="preserve">without centring the median correlation of a randomly chosen gene with the clock-output score is</w:t>
-      </w:r>
-      <w:r>
-        <w:t xml:space="preserve"> </w:t>
-      </w:r>
-      <w:r>
-        <w:t xml:space="preserve">0.44 rather than zero in RNA-seq (Supplementary Fig. S3a and Supplementary Table S13).</w:t>
+        <w:t xml:space="preserve">single Entrez identifier carry a retired symbol[15] (Supplementary Fig. S3b,c and Supplementary Tables S14 and S15). RNA-seq series</w:t>
+      </w:r>
+      <w:r>
+        <w:t xml:space="preserve"> </w:t>
+      </w:r>
+      <w:r>
+        <w:t xml:space="preserve">were used as raw counts. Expression was centred per sample before any score was computed: without centring, the median</w:t>
+      </w:r>
+      <w:r>
+        <w:t xml:space="preserve"> </w:t>
+      </w:r>
+      <w:r>
+        <w:t xml:space="preserve">correlation of a random gene with the clock-output score is 0.44 rather than zero in RNA-seq (Supplementary Fig. S3a and Supplementary Table S13).</w:t>
       </w:r>
     </w:p>
     <w:bookmarkEnd w:id="23"/>
@@ -812,7 +788,7 @@
         <w:t xml:space="preserve"> </w:t>
       </w:r>
       <w:r>
-        <w:t xml:space="preserve">for metabolic tissue[22]; a set derived empirically from the hydrocortisone perturbation</w:t>
+        <w:t xml:space="preserve">for metabolic tissue[16]; a set derived empirically from the hydrocortisone perturbation</w:t>
       </w:r>
       <w:r>
         <w:t xml:space="preserve"> </w:t>
@@ -1333,19 +1309,7 @@
         <w:t xml:space="preserve"> </w:t>
       </w:r>
       <w:r>
-        <w:t xml:space="preserve">which resolves amplitude but not period. A projection onto the full 800-gene template does not</w:t>
-      </w:r>
-      <w:r>
-        <w:t xml:space="preserve"> </w:t>
-      </w:r>
-      <w:r>
-        <w:t xml:space="preserve">validate against cosinor and is shown only to demonstrate that the choice matters (Supplementary</w:t>
-      </w:r>
-      <w:r>
-        <w:t xml:space="preserve"> </w:t>
-      </w:r>
-      <w:r>
-        <w:t xml:space="preserve">Fig. S2 and Supplementary Table S11).</w:t>
+        <w:t xml:space="preserve">which resolves amplitude but not period (Supplementary Fig. S2 and Supplementary Table S11).</w:t>
       </w:r>
     </w:p>
     <w:p>
@@ -1363,7 +1327,7 @@
         <w:t xml:space="preserve"> </w:t>
       </w:r>
       <w:r>
-        <w:t xml:space="preserve">Measured amplitude, the reference, was obtained by cosinor regression[41] of</w:t>
+        <w:t xml:space="preserve">Measured amplitude, the reference, was obtained by cosinor regression[17] of</w:t>
       </w:r>
       <w:r>
         <w:t xml:space="preserve"> </w:t>
@@ -1411,13 +1375,13 @@
         <w:t xml:space="preserve"> </w:t>
       </w:r>
       <w:r>
-        <w:t xml:space="preserve">CHIRAL[36,37], CYCLOPS[38], ZeitZeiger[39] and</w:t>
-      </w:r>
-      <w:r>
-        <w:t xml:space="preserve"> </w:t>
-      </w:r>
-      <w:r>
-        <w:t xml:space="preserve">TimeSignature[40] infer the circadian time of a single sample; none returns a per-sample amplitude,</w:t>
+        <w:t xml:space="preserve">CHIRAL[18,19], CYCLOPS[20], ZeitZeiger[21] and</w:t>
+      </w:r>
+      <w:r>
+        <w:t xml:space="preserve"> </w:t>
+      </w:r>
+      <w:r>
+        <w:t xml:space="preserve">TimeSignature[22] infer the circadian time of a single sample; none returns a per-sample amplitude,</w:t>
       </w:r>
       <w:r>
         <w:t xml:space="preserve"> </w:t>
@@ -1584,7 +1548,7 @@
         <w:t xml:space="preserve"> </w:t>
       </w:r>
       <w:r>
-        <w:t xml:space="preserve">accordingly[14]. RNA-seq cohorts were analysed with PyDESeq2[15] on raw counts,</w:t>
+        <w:t xml:space="preserve">accordingly[23]. RNA-seq cohorts were analysed with PyDESeq2[24] on raw counts,</w:t>
       </w:r>
       <w:r>
         <w:t xml:space="preserve"> </w:t>
@@ -1612,19 +1576,19 @@
         <w:t xml:space="preserve"> </w:t>
       </w:r>
       <w:r>
-        <w:t xml:space="preserve">Benjamini–Hochberg[16] and reported as FDR. Within-person designs were analysed as the</w:t>
-      </w:r>
-      <w:r>
-        <w:t xml:space="preserve"> </w:t>
-      </w:r>
-      <w:r>
-        <w:t xml:space="preserve">per-person difference with a Wilcoxon signed-rank test, reporting also the number of participants</w:t>
-      </w:r>
-      <w:r>
-        <w:t xml:space="preserve"> </w:t>
-      </w:r>
-      <w:r>
-        <w:t xml:space="preserve">changing in each direction, which is what the figures show (Supplementary Tables S3 and S19).</w:t>
+        <w:t xml:space="preserve">Benjamini–Hochberg[25] and reported as FDR. Within-person designs were analysed as the per-person</w:t>
+      </w:r>
+      <w:r>
+        <w:t xml:space="preserve"> </w:t>
+      </w:r>
+      <w:r>
+        <w:t xml:space="preserve">difference with a Wilcoxon signed-rank test, reporting the number of participants changing in each</w:t>
+      </w:r>
+      <w:r>
+        <w:t xml:space="preserve"> </w:t>
+      </w:r>
+      <w:r>
+        <w:t xml:space="preserve">direction (Supplementary Tables S3 and S19).</w:t>
       </w:r>
     </w:p>
     <w:p>
@@ -1859,7 +1823,7 @@
         <w:t xml:space="preserve"> </w:t>
       </w:r>
       <w:r>
-        <w:t xml:space="preserve">are the interactions supported by curated literature, ChIP-seq and binding motifs[23]. The</w:t>
+        <w:t xml:space="preserve">are the interactions supported by curated literature, ChIP-seq and binding motifs[26]. The</w:t>
       </w:r>
       <w:r>
         <w:t xml:space="preserve"> </w:t>
@@ -2071,7 +2035,7 @@
         <w:t xml:space="preserve"> </w:t>
       </w:r>
       <w:r>
-        <w:t xml:space="preserve">between cohorts, σ² between estimates within cohort). DerSimonian–Laird[17] two-level</w:t>
+        <w:t xml:space="preserve">between cohorts, σ² between estimates within cohort). DerSimonian–Laird[27] two-level</w:t>
       </w:r>
       <w:r>
         <w:t xml:space="preserve"> </w:t>
@@ -2107,7 +2071,7 @@
         <w:t xml:space="preserve"> </w:t>
       </w:r>
       <w:r>
-        <w:t xml:space="preserve">(zeitgeber)[18–20]:</w:t>
+        <w:t xml:space="preserve">(zeitgeber)[28–30]:</w:t>
       </w:r>
     </w:p>
     <w:p>
@@ -2371,7 +2335,7 @@
         <w:t xml:space="preserve"> </w:t>
       </w:r>
       <w:r>
-        <w:t xml:space="preserve">population at one instant. Parameters were taken from the literature[19,21] and none was</w:t>
+        <w:t xml:space="preserve">population at one instant. Parameters were taken from the literature[29,31] and none was</w:t>
       </w:r>
       <w:r>
         <w:t xml:space="preserve"> </w:t>
@@ -2557,7 +2521,7 @@
         <w:t xml:space="preserve"> </w:t>
       </w:r>
       <w:r>
-        <w:t xml:space="preserve">in GSE182120, a cohort with no differentially expressed gene at all (Fig. 1j). That relationship is a</w:t>
+        <w:t xml:space="preserve">in GSE182120 (n = 49), a cohort with no differentially expressed gene at all (Fig. 1j). That relationship is a</w:t>
       </w:r>
       <w:r>
         <w:t xml:space="preserve"> </w:t>
@@ -2719,13 +2683,19 @@
         <w:t xml:space="preserve"> </w:t>
       </w:r>
       <w:r>
-        <w:t xml:space="preserve">Across 13 cohort–tissue estimates from six cohorts and four tissues, NR3C1 expression, the level</w:t>
-      </w:r>
-      <w:r>
-        <w:t xml:space="preserve"> </w:t>
-      </w:r>
-      <w:r>
-        <w:t xml:space="preserve">of the glucocorticoid receptor, predicted clock output (pooled ρ = 0.45, 95% CI 0.31–0.58 by three-level</w:t>
+        <w:t xml:space="preserve">Across 13 cohort–tissue estimates from six cohorts and four tissue types (skeletal muscle,</w:t>
+      </w:r>
+      <w:r>
+        <w:t xml:space="preserve"> </w:t>
+      </w:r>
+      <w:r>
+        <w:t xml:space="preserve">subcutaneous and visceral adipose tissue, pancreatic islets), NR3C1 expression predicted clock</w:t>
+      </w:r>
+      <w:r>
+        <w:t xml:space="preserve"> </w:t>
+      </w:r>
+      <w:r>
+        <w:t xml:space="preserve">output (pooled ρ = 0.45, 95% CI 0.31–0.58 by three-level</w:t>
       </w:r>
       <w:r>
         <w:t xml:space="preserve"> </w:t>
@@ -2762,7 +2732,7 @@
         <w:t xml:space="preserve"> </w:t>
       </w:r>
       <w:r>
-        <w:t xml:space="preserve">estimates); twelve of the thirteen confidence intervals excluded zero, and heterogeneity across</w:t>
+        <w:t xml:space="preserve">estimates); twelve of the thirteen confidence intervals excluded zero. Heterogeneity across</w:t>
       </w:r>
       <w:r>
         <w:t xml:space="preserve"> </w:t>
@@ -2781,7 +2751,7 @@
         <w:t xml:space="preserve">I</w:t>
       </w:r>
       <w:r>
-        <w:t xml:space="preserve">² = 84% with τ² = 0.036 between cohorts and σ² = 0.011 within. The relationship is monotonic rather than driven by extremes:</w:t>
+        <w:t xml:space="preserve">² = 84%, of which tissue accounts for 89% by meta-regression. The relationship is monotonic rather than driven by extremes:</w:t>
       </w:r>
       <w:r>
         <w:t xml:space="preserve"> </w:t>
@@ -2873,13 +2843,13 @@
       </w:r>
     </w:p>
     <w:bookmarkEnd w:id="34"/>
-    <w:bookmarkStart w:id="35" w:name="X9fbee0a8b3074b011484ad81b418c4474e3c523"/>
+    <w:bookmarkStart w:id="35" w:name="X04ee9838994245f98e8646b81099e820624d269"/>
     <w:p>
       <w:pPr>
         <w:pStyle w:val="Heading3"/>
       </w:pPr>
       <w:r>
-        <w:t xml:space="preserve">3.4 Hydrocortisone shifts clock gene expression; acute insulin does not</w:t>
+        <w:t xml:space="preserve">3.4 Hydrocortisone shifts clock gene expression; the clamp reproduces the morning</w:t>
       </w:r>
     </w:p>
     <w:p>
@@ -2893,7 +2863,7 @@
         <w:t xml:space="preserve"> </w:t>
       </w:r>
       <w:r>
-        <w:t xml:space="preserve">perturbations in which sampling time is controlled (Fig. 3a). A hyperinsulinaemic clamp in skeletal muscle lowered clock-output genes in 62 of 69 participants.</w:t>
+        <w:t xml:space="preserve">perturbations in which sampling time is controlled (Fig. 3a). A hyperinsulinaemic clamp in skeletal muscle lowered clock-output genes in 61 of 68 participants.</w:t>
       </w:r>
       <w:r>
         <w:t xml:space="preserve"> </w:t>
@@ -3065,25 +3035,19 @@
         <w:t xml:space="preserve"> </w:t>
       </w:r>
       <w:r>
-        <w:t xml:space="preserve">were then tested against that ranking. Of 134 transcription factors with a</w:t>
-      </w:r>
-      <w:r>
-        <w:t xml:space="preserve"> </w:t>
-      </w:r>
-      <w:r>
-        <w:t xml:space="preserve">curated regulon, FOXO3 was the one whose inferred activity best predicted clock output</w:t>
-      </w:r>
-      <w:r>
-        <w:t xml:space="preserve"> </w:t>
-      </w:r>
-      <w:r>
-        <w:t xml:space="preserve">(ρ = 0.39), and the NF-κB family occupied the opposite extreme (NFKB1 ρ = −0.44; Fig. 4a and</w:t>
-      </w:r>
-      <w:r>
-        <w:t xml:space="preserve"> </w:t>
-      </w:r>
-      <w:r>
-        <w:t xml:space="preserve">Supplementary Table S9); the FOXO3 regulon includes TXNIP and FBXO32 (Supplementary Fig. S4). The</w:t>
+        <w:t xml:space="preserve">were then tested against that ranking. Of 134 transcription factors with a curated regulon, FOXO3 was the one whose inferred activity best</w:t>
+      </w:r>
+      <w:r>
+        <w:t xml:space="preserve"> </w:t>
+      </w:r>
+      <w:r>
+        <w:t xml:space="preserve">predicted clock output (ρ = 0.39) and the NF-κB family occupied the opposite extreme (NFKB1</w:t>
+      </w:r>
+      <w:r>
+        <w:t xml:space="preserve"> </w:t>
+      </w:r>
+      <w:r>
+        <w:t xml:space="preserve">ρ = −0.44; both n = 232; Fig. 4a and Supplementary Table S9); the FOXO3 regulon includes TXNIP and FBXO32 (Supplementary Fig. S4). The</w:t>
       </w:r>
       <w:r>
         <w:t xml:space="preserve"> </w:t>
@@ -3127,19 +3091,13 @@
         <w:t xml:space="preserve"> </w:t>
       </w:r>
       <w:r>
-        <w:t xml:space="preserve">(Fig. 4c and Supplementary Table S10). The axis therefore tracks the clinical signature of</w:t>
-      </w:r>
-      <w:r>
-        <w:t xml:space="preserve"> </w:t>
-      </w:r>
-      <w:r>
-        <w:t xml:space="preserve">glucocorticoid exposure and not that of metabolic disease, which is the distinction the next two</w:t>
-      </w:r>
-      <w:r>
-        <w:t xml:space="preserve"> </w:t>
-      </w:r>
-      <w:r>
-        <w:t xml:space="preserve">results test. In the one cohort with insulin sensitivity measured in the same people[35], the clock-output score did</w:t>
+        <w:t xml:space="preserve">(Fig. 4c and Supplementary Table S10). The axis therefore tracks the clinical signature of glucocorticoid exposure rather than that of</w:t>
+      </w:r>
+      <w:r>
+        <w:t xml:space="preserve"> </w:t>
+      </w:r>
+      <w:r>
+        <w:t xml:space="preserve">metabolic disease. The next two results test that distinction. In the one cohort with insulin sensitivity measured in the same people[32], the clock-output score did</w:t>
       </w:r>
       <w:r>
         <w:t xml:space="preserve"> </w:t>
@@ -3161,13 +3119,13 @@
         <w:t xml:space="preserve"> </w:t>
       </w:r>
       <w:r>
-        <w:t xml:space="preserve">= 48 with an SI value from the frequently</w:t>
-      </w:r>
-      <w:r>
-        <w:t xml:space="preserve"> </w:t>
-      </w:r>
-      <w:r>
-        <w:t xml:space="preserve">sampled intravenous glucose tolerance test), although it was graded by clinical status (median score</w:t>
+        <w:t xml:space="preserve">= 48 with an insulin sensitivity index</w:t>
+      </w:r>
+      <w:r>
+        <w:t xml:space="preserve"> </w:t>
+      </w:r>
+      <w:r>
+        <w:t xml:space="preserve">from the frequently sampled intravenous glucose tolerance test), although it was graded by clinical status (median score</w:t>
       </w:r>
       <w:r>
         <w:t xml:space="preserve"> </w:t>
@@ -3179,7 +3137,13 @@
         <w:t xml:space="preserve"> </w:t>
       </w:r>
       <w:r>
-        <w:t xml:space="preserve">−0.31 in diabetes). Within adipose tissue, adiposity separates the two arms of the axis: HSD11B1, the 11β-hydroxysteroid dehydrogenase type 1 that regenerates cortisol locally, rises with leptin (ρ = 0.66) while the receptor falls (ρ = −0.31), and</w:t>
+        <w:t xml:space="preserve">−0.31 in diabetes). Within adipose tissue, adiposity separates the two arms of the axis: HSD11B1, the 11β-hydroxysteroid dehydrogenase type 1 that regenerates cortisol locally, rises</w:t>
+      </w:r>
+      <w:r>
+        <w:t xml:space="preserve"> </w:t>
+      </w:r>
+      <w:r>
+        <w:t xml:space="preserve">with leptin (ρ = 0.66) while the receptor falls (ρ = −0.31; n = 232), and</w:t>
       </w:r>
       <w:r>
         <w:t xml:space="preserve"> </w:t>
@@ -3472,7 +3436,7 @@
         <w:t xml:space="preserve"> </w:t>
       </w:r>
       <w:r>
-        <w:t xml:space="preserve">circulating hormone. The decisive comparison is within individuals and at a fixed hour of day:</w:t>
+        <w:t xml:space="preserve">circulating hormone. The decisive comparison is within individuals and at a fixed hour of the day:</w:t>
       </w:r>
       <w:r>
         <w:t xml:space="preserve"> </w:t>
@@ -3504,13 +3468,13 @@
         <w:t xml:space="preserve"> </w:t>
       </w:r>
       <w:r>
-        <w:t xml:space="preserve">of the rhythmic signal. Obesity flattens the cortisol rhythm[31,32], Cushing syndrome and exogenous</w:t>
-      </w:r>
-      <w:r>
-        <w:t xml:space="preserve"> </w:t>
-      </w:r>
-      <w:r>
-        <w:t xml:space="preserve">hydrocortisone impose sustained exposure[33,34], and adiposity lowers the receptor; all three lower the</w:t>
+        <w:t xml:space="preserve">of the rhythmic signal. Obesity flattens the cortisol rhythm[33,34], Cushing syndrome and exogenous</w:t>
+      </w:r>
+      <w:r>
+        <w:t xml:space="preserve"> </w:t>
+      </w:r>
+      <w:r>
+        <w:t xml:space="preserve">hydrocortisone impose sustained exposure[35,36], and adiposity lowers the receptor; all three lower the</w:t>
       </w:r>
       <w:r>
         <w:t xml:space="preserve"> </w:t>
@@ -3598,13 +3562,13 @@
         <w:t xml:space="preserve"> </w:t>
       </w:r>
       <w:r>
-        <w:t xml:space="preserve">diabetes[26,27]. These compounds lower the local regeneration of cortisol, that is, the</w:t>
-      </w:r>
-      <w:r>
-        <w:t xml:space="preserve"> </w:t>
-      </w:r>
-      <w:r>
-        <w:t xml:space="preserve">ligand[28,42,43]. Our data separate the two arms of that axis: within adipose tissue HSD11B1</w:t>
+        <w:t xml:space="preserve">diabetes[37,38]. These compounds lower the local regeneration of cortisol, that is, the</w:t>
+      </w:r>
+      <w:r>
+        <w:t xml:space="preserve"> </w:t>
+      </w:r>
+      <w:r>
+        <w:t xml:space="preserve">ligand[39,40,41]. Our data separate the two arms of that axis: within adipose tissue HSD11B1</w:t>
       </w:r>
       <w:r>
         <w:t xml:space="preserve"> </w:t>
@@ -3634,7 +3598,7 @@
         <w:t xml:space="preserve"> </w:t>
       </w:r>
       <w:r>
-        <w:t xml:space="preserve">11β-HSD1 inhibition with banked adipose tissue[29,30], the response should be graded by the</w:t>
+        <w:t xml:space="preserve">11β-HSD1 inhibition with banked adipose tissue[42,43], the response should be graded by the</w:t>
       </w:r>
       <w:r>
         <w:t xml:space="preserve"> </w:t>
@@ -3666,7 +3630,19 @@
         <w:pStyle w:val="BodyText"/>
       </w:pPr>
       <w:r>
-        <w:t xml:space="preserve">Our analysis has four limitations. Phase and amplitude are inferred from expression rather than</w:t>
+        <w:t xml:space="preserve">Our analysis has five limitations. NR3C1 expression is a proxy for receptor availability, and</w:t>
+      </w:r>
+      <w:r>
+        <w:t xml:space="preserve"> </w:t>
+      </w:r>
+      <w:r>
+        <w:t xml:space="preserve">chronic glucocorticoid exposure also lowers that transcript, so these data do not separate a</w:t>
+      </w:r>
+      <w:r>
+        <w:t xml:space="preserve"> </w:t>
+      </w:r>
+      <w:r>
+        <w:t xml:space="preserve">receptor that limits signalling from one suppressed by the exposure it reports. Phase and amplitude are inferred from expression rather than</w:t>
       </w:r>
       <w:r>
         <w:t xml:space="preserve"> </w:t>
@@ -3897,187 +3873,187 @@
         <w:t xml:space="preserve"> </w:t>
       </w:r>
       <w:r>
-        <w:t xml:space="preserve">13. Dai M, Wang P, Boyd AD, Kostov G, Athey B, Jones EG, et al. Evolving gene/transcript definitions significantly alter the interpretation of GeneChip data. Nucleic Acids Res 2005;33:e175. https://doi.org/10.1093/nar/gni179.</w:t>
-      </w:r>
-      <w:r>
-        <w:t xml:space="preserve"> </w:t>
-      </w:r>
-      <w:r>
-        <w:t xml:space="preserve">14. Smyth GK. Linear models and empirical Bayes methods for assessing differential expression in microarray experiments. Stat Appl Genet Mol Biol 2004;3:Article3.</w:t>
-      </w:r>
-      <w:r>
-        <w:t xml:space="preserve"> </w:t>
-      </w:r>
-      <w:r>
-        <w:t xml:space="preserve">15. Muzellec B, Teleńczuk M, Cabeli V, Andreux M. PyDESeq2: a python package for bulk RNA-seq differential expression analysis. Bioinformatics 2023;39:btad547.</w:t>
-      </w:r>
-      <w:r>
-        <w:t xml:space="preserve"> </w:t>
-      </w:r>
-      <w:r>
-        <w:t xml:space="preserve">16. Benjamini Y, Hochberg Y. Controlling the false discovery rate: a practical and powerful approach to multiple testing. J R Stat Soc B 1995;57:289–300.</w:t>
-      </w:r>
-      <w:r>
-        <w:t xml:space="preserve"> </w:t>
-      </w:r>
-      <w:r>
-        <w:t xml:space="preserve">17. DerSimonian R, Laird N. Meta-analysis in clinical trials. Control Clin Trials 1986;7:177–88.</w:t>
-      </w:r>
-      <w:r>
-        <w:t xml:space="preserve"> </w:t>
-      </w:r>
-      <w:r>
-        <w:t xml:space="preserve">18. Granada AE, Bordyugov G, Kramer A, Herzel H. Human chronotypes from a theoretical perspective. PLoS One 2013;8:e59464.</w:t>
-      </w:r>
-      <w:r>
-        <w:t xml:space="preserve"> </w:t>
-      </w:r>
-      <w:r>
-        <w:t xml:space="preserve">19. Abraham U, Granada AE, Westermark PO, Heine M, Kramer A, Herzel H. Coupling governs entrainment range of circadian clocks. Mol Syst Biol 2010;6:438.</w:t>
-      </w:r>
-      <w:r>
-        <w:t xml:space="preserve"> </w:t>
-      </w:r>
-      <w:r>
-        <w:t xml:space="preserve">20. Schmal C, Herzel H, Myung J. Clocks in the wild: entrainment to natural light. Front Physiol 2020;11:272.</w:t>
-      </w:r>
-      <w:r>
-        <w:t xml:space="preserve"> </w:t>
-      </w:r>
-      <w:r>
-        <w:t xml:space="preserve">21. Li Y, Androulakis IP. The SCN–HPA–periphery circadian timing system: mathematical modeling of clock synchronization and the effects of photoperiod on jetlag adaptation. J Biol Rhythms 2023;38:435–53.</w:t>
-      </w:r>
-      <w:r>
-        <w:t xml:space="preserve"> </w:t>
-      </w:r>
-      <w:r>
-        <w:t xml:space="preserve">22. Liberzon A, Birger C, Thorvaldsdóttir H, Ghandi M, Mesirov JP, Tamayo P. The Molecular Signatures Database hallmark gene set collection. Cell Syst 2015;1:417–25.</w:t>
-      </w:r>
-      <w:r>
-        <w:t xml:space="preserve"> </w:t>
-      </w:r>
-      <w:r>
-        <w:t xml:space="preserve">23. Garcia-Alonso L, Holland CH, Ibrahim MM, Turei D, Saez-Rodriguez J. Benchmark and integration of resources for the estimation of human transcription factor activities. Genome Res 2019;29:1363–75.</w:t>
-      </w:r>
-      <w:r>
-        <w:t xml:space="preserve"> </w:t>
-      </w:r>
-      <w:r>
-        <w:t xml:space="preserve">24. Hughes ME, Abruzzi KC, Allada R, et al. Guidelines for genome-scale analysis of biological rhythms. J Biol Rhythms 2017;32:380–93.</w:t>
-      </w:r>
-      <w:r>
-        <w:t xml:space="preserve"> </w:t>
-      </w:r>
-      <w:r>
-        <w:t xml:space="preserve">25. Ruben MD, Francey LJ, Guo Y, et al. A large-scale study reveals 24-h operational rhythms in hospital treatment. Proc Natl Acad Sci U S A 2019;116:20953–8.</w:t>
-      </w:r>
-      <w:r>
-        <w:t xml:space="preserve"> </w:t>
-      </w:r>
-      <w:r>
-        <w:t xml:space="preserve">26. Feig PU, Shah S, Hermanowski-Vosatka A, et al. Effects of an 11β-hydroxysteroid dehydrogenase type 1 inhibitor, MK-0916, in patients with type 2 diabetes mellitus and metabolic syndrome. Diabetes Obes Metab 2011;13:498–504.</w:t>
-      </w:r>
-      <w:r>
-        <w:t xml:space="preserve"> </w:t>
-      </w:r>
-      <w:r>
-        <w:t xml:space="preserve">27. Rosenstock J, Banarer S, Fonseca VA, et al. The 11-beta-hydroxysteroid dehydrogenase type 1 inhibitor INCB13739 improves hyperglycemia in patients with type 2 diabetes inadequately controlled by metformin monotherapy. Diabetes Care 2010;33:1516–22.</w:t>
-      </w:r>
-      <w:r>
-        <w:t xml:space="preserve"> </w:t>
-      </w:r>
-      <w:r>
-        <w:t xml:space="preserve">28. Morgan SA, McCabe EL, Gathercole LL, et al. 11β-HSD1 is the major regulator of the tissue-specific effects of circulating glucocorticoid excess. Proc Natl Acad Sci U S A 2014;111:E2482–91.</w:t>
-      </w:r>
-      <w:r>
-        <w:t xml:space="preserve"> </w:t>
-      </w:r>
-      <w:r>
-        <w:t xml:space="preserve">29. Othonos N, Pofi R, Arvaniti A, et al. 11β-HSD1 inhibition in men mitigates prednisolone-induced adverse effects in a proof-of-concept randomised double-blind placebo-controlled trial. Nat Commun 2023;14:1025.</w:t>
-      </w:r>
-      <w:r>
-        <w:t xml:space="preserve"> </w:t>
-      </w:r>
-      <w:r>
-        <w:t xml:space="preserve">30. Ajjan RA, Hensor EMA, Del Galdo F, et al. Oral 11β-HSD1 inhibitor AZD4017 improves wound healing and skin integrity in adults with type 2 diabetes mellitus: a pilot randomized controlled trial. Eur J Endocrinol 2022;186:441–55.</w:t>
-      </w:r>
-      <w:r>
-        <w:t xml:space="preserve"> </w:t>
-      </w:r>
-      <w:r>
-        <w:t xml:space="preserve">31. Björntorp P, Rosmond R. Obesity and cortisol. Nutrition 2000;16:924–36.</w:t>
-      </w:r>
-      <w:r>
-        <w:t xml:space="preserve"> </w:t>
-      </w:r>
-      <w:r>
-        <w:t xml:space="preserve">32. Incollingo Rodriguez AC, Epel ES, White ML, Standen EC, Seckl JR, Tomiyama AJ. Hypothalamic–pituitary–adrenal axis dysregulation and cortisol activity in obesity: a systematic review. Psychoneuroendocrinology 2015;62:301–18.</w:t>
-      </w:r>
-      <w:r>
-        <w:t xml:space="preserve"> </w:t>
-      </w:r>
-      <w:r>
-        <w:t xml:space="preserve">33. Pivonello R, Isidori AM, De Martino MC, Newell-Price J, Biller BMK, Colao A. Complications of Cushing’s syndrome: state of the art. Lancet Diabetes Endocrinol 2016;4:611–29.</w:t>
-      </w:r>
-      <w:r>
-        <w:t xml:space="preserve"> </w:t>
-      </w:r>
-      <w:r>
-        <w:t xml:space="preserve">34. Hackett RA, Kivimäki M, Kumari M, Steptoe A. Diurnal cortisol patterns, future diabetes, and impaired glucose metabolism in the Whitehall II cohort study. J Clin Endocrinol Metab 2016;101:619–25.</w:t>
-      </w:r>
-      <w:r>
-        <w:t xml:space="preserve"> </w:t>
-      </w:r>
-      <w:r>
-        <w:t xml:space="preserve">35. Sharma NK, Sajuthi SP, Chou JW, et al. Tissue-specific and genetic regulation of insulin sensitivity-associated transcripts in African Americans. J Clin Endocrinol Metab 2016;101:1455–68.</w:t>
-      </w:r>
-      <w:r>
-        <w:t xml:space="preserve"> </w:t>
-      </w:r>
-      <w:r>
-        <w:t xml:space="preserve">36. Talamanca L, Gobet C, Naef F. Sex-dimorphic and age-dependent organization of 24-hour gene expression rhythms in humans. Science 2023;379:478–83.</w:t>
-      </w:r>
-      <w:r>
-        <w:t xml:space="preserve"> </w:t>
-      </w:r>
-      <w:r>
-        <w:t xml:space="preserve">37. Salati A, Gobet C, Naef F. scRITMO: inference of circadian phase from single-cell and bulk transcriptomes [preprint]. bioRxiv 2026. Available at github.com/AndreaSalati/scRITMO</w:t>
-      </w:r>
-      <w:r>
-        <w:t xml:space="preserve"> </w:t>
-      </w:r>
-      <w:r>
-        <w:t xml:space="preserve">38. Anafi RC, Francey LJ, Hogenesch JB, Kim J. CYCLOPS reveals human transcriptional rhythms in health and disease. Proc Natl Acad Sci U S A 2017;114:5312–7.</w:t>
-      </w:r>
-      <w:r>
-        <w:t xml:space="preserve"> </w:t>
-      </w:r>
-      <w:r>
-        <w:t xml:space="preserve">39. Hughey JJ, Hastie T, Butte AJ. ZeitZeiger: supervised learning for high-dimensional data from an oscillatory system. Nucleic Acids Res 2016;44:e80.</w:t>
-      </w:r>
-      <w:r>
-        <w:t xml:space="preserve"> </w:t>
-      </w:r>
-      <w:r>
-        <w:t xml:space="preserve">40. Braun R, Kath WL, Iwanaszko M, et al. Universal method for robust detection of circadian state from gene expression. Proc Natl Acad Sci U S A 2018;115:E9247–56.</w:t>
-      </w:r>
-      <w:r>
-        <w:t xml:space="preserve"> </w:t>
-      </w:r>
-      <w:r>
-        <w:t xml:space="preserve">41. Cornelissen G. Cosinor-based rhythmometry. Theor Biol Med Model 2014;11:16.</w:t>
-      </w:r>
-      <w:r>
-        <w:t xml:space="preserve"> </w:t>
-      </w:r>
-      <w:r>
-        <w:t xml:space="preserve">42. Masuzaki H, Paterson J, Shinyama H, et al. A transgenic model of visceral obesity and the metabolic syndrome. Science 2001;294:2166–70.</w:t>
-      </w:r>
-      <w:r>
-        <w:t xml:space="preserve"> </w:t>
-      </w:r>
-      <w:r>
-        <w:t xml:space="preserve">43. Lee RA, Harris CA, Wang JC. Glucocorticoid receptor and adipocyte biology. Nucl Receptor Res 2018;5:101373.</w:t>
+        <w:t xml:space="preserve">13. Hughes ME, Abruzzi KC, Allada R, et al. Guidelines for genome-scale analysis of biological rhythms. J Biol Rhythms 2017;32:380–93.</w:t>
+      </w:r>
+      <w:r>
+        <w:t xml:space="preserve"> </w:t>
+      </w:r>
+      <w:r>
+        <w:t xml:space="preserve">14. Ruben MD, Francey LJ, Guo Y, et al. A large-scale study reveals 24-h operational rhythms in hospital treatment. Proc Natl Acad Sci U S A 2019;116:20953–8.</w:t>
+      </w:r>
+      <w:r>
+        <w:t xml:space="preserve"> </w:t>
+      </w:r>
+      <w:r>
+        <w:t xml:space="preserve">15. Dai M, Wang P, Boyd AD, Kostov G, Athey B, Jones EG, et al. Evolving gene/transcript definitions significantly alter the interpretation of GeneChip data. Nucleic Acids Res 2005;33:e175. https://doi.org/10.1093/nar/gni179.</w:t>
+      </w:r>
+      <w:r>
+        <w:t xml:space="preserve"> </w:t>
+      </w:r>
+      <w:r>
+        <w:t xml:space="preserve">16. Liberzon A, Birger C, Thorvaldsdóttir H, Ghandi M, Mesirov JP, Tamayo P. The Molecular Signatures Database hallmark gene set collection. Cell Syst 2015;1:417–25.</w:t>
+      </w:r>
+      <w:r>
+        <w:t xml:space="preserve"> </w:t>
+      </w:r>
+      <w:r>
+        <w:t xml:space="preserve">17. Cornelissen G. Cosinor-based rhythmometry. Theor Biol Med Model 2014;11:16.</w:t>
+      </w:r>
+      <w:r>
+        <w:t xml:space="preserve"> </w:t>
+      </w:r>
+      <w:r>
+        <w:t xml:space="preserve">18. Talamanca L, Gobet C, Naef F. Sex-dimorphic and age-dependent organization of 24-hour gene expression rhythms in humans. Science 2023;379:478–83.</w:t>
+      </w:r>
+      <w:r>
+        <w:t xml:space="preserve"> </w:t>
+      </w:r>
+      <w:r>
+        <w:t xml:space="preserve">19. Salati A, Gobet C, Naef F. scRITMO: inference of circadian phase from single-cell and bulk transcriptomes [preprint]. bioRxiv 2026. Available at github.com/AndreaSalati/scRITMO</w:t>
+      </w:r>
+      <w:r>
+        <w:t xml:space="preserve"> </w:t>
+      </w:r>
+      <w:r>
+        <w:t xml:space="preserve">20. Anafi RC, Francey LJ, Hogenesch JB, Kim J. CYCLOPS reveals human transcriptional rhythms in health and disease. Proc Natl Acad Sci U S A 2017;114:5312–7.</w:t>
+      </w:r>
+      <w:r>
+        <w:t xml:space="preserve"> </w:t>
+      </w:r>
+      <w:r>
+        <w:t xml:space="preserve">21. Hughey JJ, Hastie T, Butte AJ. ZeitZeiger: supervised learning for high-dimensional data from an oscillatory system. Nucleic Acids Res 2016;44:e80.</w:t>
+      </w:r>
+      <w:r>
+        <w:t xml:space="preserve"> </w:t>
+      </w:r>
+      <w:r>
+        <w:t xml:space="preserve">22. Braun R, Kath WL, Iwanaszko M, et al. Universal method for robust detection of circadian state from gene expression. Proc Natl Acad Sci U S A 2018;115:E9247–56.</w:t>
+      </w:r>
+      <w:r>
+        <w:t xml:space="preserve"> </w:t>
+      </w:r>
+      <w:r>
+        <w:t xml:space="preserve">23. Smyth GK. Linear models and empirical Bayes methods for assessing differential expression in microarray experiments. Stat Appl Genet Mol Biol 2004;3:Article3.</w:t>
+      </w:r>
+      <w:r>
+        <w:t xml:space="preserve"> </w:t>
+      </w:r>
+      <w:r>
+        <w:t xml:space="preserve">24. Muzellec B, Teleńczuk M, Cabeli V, Andreux M. PyDESeq2: a python package for bulk RNA-seq differential expression analysis. Bioinformatics 2023;39:btad547.</w:t>
+      </w:r>
+      <w:r>
+        <w:t xml:space="preserve"> </w:t>
+      </w:r>
+      <w:r>
+        <w:t xml:space="preserve">25. Benjamini Y, Hochberg Y. Controlling the false discovery rate: a practical and powerful approach to multiple testing. J R Stat Soc B 1995;57:289–300.</w:t>
+      </w:r>
+      <w:r>
+        <w:t xml:space="preserve"> </w:t>
+      </w:r>
+      <w:r>
+        <w:t xml:space="preserve">26. Garcia-Alonso L, Holland CH, Ibrahim MM, Turei D, Saez-Rodriguez J. Benchmark and integration of resources for the estimation of human transcription factor activities. Genome Res 2019;29:1363–75.</w:t>
+      </w:r>
+      <w:r>
+        <w:t xml:space="preserve"> </w:t>
+      </w:r>
+      <w:r>
+        <w:t xml:space="preserve">27. DerSimonian R, Laird N. Meta-analysis in clinical trials. Control Clin Trials 1986;7:177–88.</w:t>
+      </w:r>
+      <w:r>
+        <w:t xml:space="preserve"> </w:t>
+      </w:r>
+      <w:r>
+        <w:t xml:space="preserve">28. Granada AE, Bordyugov G, Kramer A, Herzel H. Human chronotypes from a theoretical perspective. PLoS One 2013;8:e59464.</w:t>
+      </w:r>
+      <w:r>
+        <w:t xml:space="preserve"> </w:t>
+      </w:r>
+      <w:r>
+        <w:t xml:space="preserve">29. Abraham U, Granada AE, Westermark PO, Heine M, Kramer A, Herzel H. Coupling governs entrainment range of circadian clocks. Mol Syst Biol 2010;6:438.</w:t>
+      </w:r>
+      <w:r>
+        <w:t xml:space="preserve"> </w:t>
+      </w:r>
+      <w:r>
+        <w:t xml:space="preserve">30. Schmal C, Herzel H, Myung J. Clocks in the wild: entrainment to natural light. Front Physiol 2020;11:272.</w:t>
+      </w:r>
+      <w:r>
+        <w:t xml:space="preserve"> </w:t>
+      </w:r>
+      <w:r>
+        <w:t xml:space="preserve">31. Li Y, Androulakis IP. The SCN–HPA–periphery circadian timing system: mathematical modeling of clock synchronization and the effects of photoperiod on jetlag adaptation. J Biol Rhythms 2023;38:435–53.</w:t>
+      </w:r>
+      <w:r>
+        <w:t xml:space="preserve"> </w:t>
+      </w:r>
+      <w:r>
+        <w:t xml:space="preserve">32. Sharma NK, Sajuthi SP, Chou JW, et al. Tissue-specific and genetic regulation of insulin sensitivity-associated transcripts in African Americans. J Clin Endocrinol Metab 2016;101:1455–68.</w:t>
+      </w:r>
+      <w:r>
+        <w:t xml:space="preserve"> </w:t>
+      </w:r>
+      <w:r>
+        <w:t xml:space="preserve">33. Björntorp P, Rosmond R. Obesity and cortisol. Nutrition 2000;16:924–36.</w:t>
+      </w:r>
+      <w:r>
+        <w:t xml:space="preserve"> </w:t>
+      </w:r>
+      <w:r>
+        <w:t xml:space="preserve">34. Incollingo Rodriguez AC, Epel ES, White ML, Standen EC, Seckl JR, Tomiyama AJ. Hypothalamic–pituitary–adrenal axis dysregulation and cortisol activity in obesity: a systematic review. Psychoneuroendocrinology 2015;62:301–18.</w:t>
+      </w:r>
+      <w:r>
+        <w:t xml:space="preserve"> </w:t>
+      </w:r>
+      <w:r>
+        <w:t xml:space="preserve">35. Pivonello R, Isidori AM, De Martino MC, Newell-Price J, Biller BMK, Colao A. Complications of Cushing’s syndrome: state of the art. Lancet Diabetes Endocrinol 2016;4:611–29.</w:t>
+      </w:r>
+      <w:r>
+        <w:t xml:space="preserve"> </w:t>
+      </w:r>
+      <w:r>
+        <w:t xml:space="preserve">36. Hackett RA, Kivimäki M, Kumari M, Steptoe A. Diurnal cortisol patterns, future diabetes, and impaired glucose metabolism in the Whitehall II cohort study. J Clin Endocrinol Metab 2016;101:619–25.</w:t>
+      </w:r>
+      <w:r>
+        <w:t xml:space="preserve"> </w:t>
+      </w:r>
+      <w:r>
+        <w:t xml:space="preserve">37. Feig PU, Shah S, Hermanowski-Vosatka A, et al. Effects of an 11β-hydroxysteroid dehydrogenase type 1 inhibitor, MK-0916, in patients with type 2 diabetes mellitus and metabolic syndrome. Diabetes Obes Metab 2011;13:498–504.</w:t>
+      </w:r>
+      <w:r>
+        <w:t xml:space="preserve"> </w:t>
+      </w:r>
+      <w:r>
+        <w:t xml:space="preserve">38. Rosenstock J, Banarer S, Fonseca VA, et al. The 11-beta-hydroxysteroid dehydrogenase type 1 inhibitor INCB13739 improves hyperglycemia in patients with type 2 diabetes inadequately controlled by metformin monotherapy. Diabetes Care 2010;33:1516–22.</w:t>
+      </w:r>
+      <w:r>
+        <w:t xml:space="preserve"> </w:t>
+      </w:r>
+      <w:r>
+        <w:t xml:space="preserve">39. Morgan SA, McCabe EL, Gathercole LL, et al. 11β-HSD1 is the major regulator of the tissue-specific effects of circulating glucocorticoid excess. Proc Natl Acad Sci U S A 2014;111:E2482–91.</w:t>
+      </w:r>
+      <w:r>
+        <w:t xml:space="preserve"> </w:t>
+      </w:r>
+      <w:r>
+        <w:t xml:space="preserve">40. Masuzaki H, Paterson J, Shinyama H, et al. A transgenic model of visceral obesity and the metabolic syndrome. Science 2001;294:2166–70.</w:t>
+      </w:r>
+      <w:r>
+        <w:t xml:space="preserve"> </w:t>
+      </w:r>
+      <w:r>
+        <w:t xml:space="preserve">41. Lee RA, Harris CA, Wang JC. Glucocorticoid receptor and adipocyte biology. Nucl Receptor Res 2018;5:101373.</w:t>
+      </w:r>
+      <w:r>
+        <w:t xml:space="preserve"> </w:t>
+      </w:r>
+      <w:r>
+        <w:t xml:space="preserve">42. Othonos N, Pofi R, Arvaniti A, et al. 11β-HSD1 inhibition in men mitigates prednisolone-induced adverse effects in a proof-of-concept randomised double-blind placebo-controlled trial. Nat Commun 2023;14:1025.</w:t>
+      </w:r>
+      <w:r>
+        <w:t xml:space="preserve"> </w:t>
+      </w:r>
+      <w:r>
+        <w:t xml:space="preserve">43. Ajjan RA, Hensor EMA, Del Galdo F, et al. Oral 11β-HSD1 inhibitor AZD4017 improves wound healing and skin integrity in adults with type 2 diabetes mellitus: a pilot randomized controlled trial. Eur J Endocrinol 2022;186:441–55.</w:t>
       </w:r>
     </w:p>
     <w:bookmarkEnd w:id="42"/>
@@ -4303,31 +4279,25 @@
         <w:t xml:space="preserve"> </w:t>
       </w:r>
       <w:r>
-        <w:t xml:space="preserve">OpenAI tools assisted with language editing and Anthropic</w:t>
-      </w:r>
-      <w:r>
-        <w:t xml:space="preserve"> </w:t>
-      </w:r>
-      <w:r>
-        <w:t xml:space="preserve">Claude assisted with code development and with the analyses reported here. All schematic</w:t>
-      </w:r>
-      <w:r>
-        <w:t xml:space="preserve"> </w:t>
-      </w:r>
-      <w:r>
-        <w:t xml:space="preserve">illustrations were prepared by the authors; no AI-generated images are included. The authors</w:t>
-      </w:r>
-      <w:r>
-        <w:t xml:space="preserve"> </w:t>
-      </w:r>
-      <w:r>
-        <w:t xml:space="preserve">reviewed the resulting text, code and figures and take full responsibility for the content of the</w:t>
-      </w:r>
-      <w:r>
-        <w:t xml:space="preserve"> </w:t>
-      </w:r>
-      <w:r>
-        <w:t xml:space="preserve">manuscript.</w:t>
+        <w:t xml:space="preserve">AI-assisted tools were used for language editing and to</w:t>
+      </w:r>
+      <w:r>
+        <w:t xml:space="preserve"> </w:t>
+      </w:r>
+      <w:r>
+        <w:t xml:space="preserve">support code development for the analyses reported here. All data visualisations are derived from</w:t>
+      </w:r>
+      <w:r>
+        <w:t xml:space="preserve"> </w:t>
+      </w:r>
+      <w:r>
+        <w:t xml:space="preserve">the underlying data by the reproducible code deposited with this work. The authors reviewed all</w:t>
+      </w:r>
+      <w:r>
+        <w:t xml:space="preserve"> </w:t>
+      </w:r>
+      <w:r>
+        <w:t xml:space="preserve">resulting text, code and figures and take full responsibility for the content of the manuscript.</w:t>
       </w:r>
     </w:p>
     <w:bookmarkEnd w:id="43"/>
@@ -4345,13 +4315,7 @@
         <w:pStyle w:val="FirstParagraph"/>
       </w:pPr>
       <w:r>
-        <w:t xml:space="preserve">FDR, false discovery rate; GR, glucocorticoid receptor; HPA, hypothalamic–pituitary–adrenal;</w:t>
-      </w:r>
-      <w:r>
-        <w:t xml:space="preserve"> </w:t>
-      </w:r>
-      <w:r>
-        <w:t xml:space="preserve">RIN, RNA integrity number; T2D, type 2 diabetes; TZD, thiazolidinedione.</w:t>
+        <w:t xml:space="preserve">CI, confidence interval; FDR, false discovery rate; HPA, hypothalamic–pituitary–adrenal.</w:t>
       </w:r>
     </w:p>
     <w:p>
@@ -4369,13 +4333,6 @@
       </w:pPr>
       <w:r>
         <w:t xml:space="preserve">Figures</w:t>
-      </w:r>
-    </w:p>
-    <w:p>
-      <w:r>
-        <w:pict>
-          <v:rect style="width:0;height:1.5pt" o:hralign="center" o:hrstd="t" o:hr="t"/>
-        </w:pict>
       </w:r>
     </w:p>
     <w:p>
@@ -5037,13 +4994,13 @@
       </w:r>
     </w:p>
     <w:bookmarkEnd w:id="56"/>
-    <w:bookmarkStart w:id="60" w:name="Xb84f48e6c69f4a8e33f85d9a6a7b94954db5ea2"/>
+    <w:bookmarkStart w:id="60" w:name="X903aa302dd90f5adf17617741a31ff86b0a1903"/>
     <w:p>
       <w:pPr>
         <w:pStyle w:val="Heading2"/>
       </w:pPr>
       <w:r>
-        <w:t xml:space="preserve">Figure 3 | Hydrocortisone, but not acute insulin, shifts clock gene expression</w:t>
+        <w:t xml:space="preserve">Figure 3 | Hydrocortisone shifts clock gene expression; the clamp reproduces the morning</w:t>
       </w:r>
     </w:p>
     <w:p>
@@ -5503,13 +5460,13 @@
       </w:r>
     </w:p>
     <w:bookmarkEnd w:id="64"/>
-    <w:bookmarkStart w:id="65" w:name="X35f32b80f9cf4c5fc2102112fc46595ed21d4ca"/>
+    <w:bookmarkStart w:id="65" w:name="Xa0ad73c96389e1e0f6545908f61414a473304b1"/>
     <w:p>
       <w:pPr>
         <w:pStyle w:val="Heading2"/>
       </w:pPr>
       <w:r>
-        <w:t xml:space="preserve">Figure 5 | A forced oscillator model of glucocorticoid entrainment</w:t>
+        <w:t xml:space="preserve">Figure 5 | A forced-oscillator model of the glucocorticoid signal</w:t>
       </w:r>
     </w:p>
     <w:p>

</xml_diff>

<commit_message>
v1.2.3: control externo del estimador en la Figura 1; retirar los analisis exploratorios
</commit_message>
<xml_diff>
--- a/manuscript/MANUSCRIPT_v2.docx
+++ b/manuscript/MANUSCRIPT_v2.docx
@@ -656,25 +656,13 @@
         <w:pStyle w:val="FirstParagraph"/>
       </w:pPr>
       <w:r>
-        <w:t xml:space="preserve">Nineteen public transcriptomic series and GTEx v11 were used, covering skeletal muscle,</w:t>
-      </w:r>
-      <w:r>
-        <w:t xml:space="preserve"> </w:t>
-      </w:r>
-      <w:r>
-        <w:t xml:space="preserve">subcutaneous and visceral adipose tissue, pancreatic islets and cultured myotubes from 2,900</w:t>
-      </w:r>
-      <w:r>
-        <w:t xml:space="preserve"> </w:t>
-      </w:r>
-      <w:r>
-        <w:t xml:space="preserve">individuals. Supplementary Table S1 lists for each series the accession, tissue, platform, sample</w:t>
-      </w:r>
-      <w:r>
-        <w:t xml:space="preserve"> </w:t>
-      </w:r>
-      <w:r>
-        <w:t xml:space="preserve">number and the role it plays in the analysis; two accessions are the two tissues of a single study</w:t>
+        <w:t xml:space="preserve">Nineteen public transcriptomic series and GTEx v11 were used; Supplementary Table S1 lists the</w:t>
+      </w:r>
+      <w:r>
+        <w:t xml:space="preserve"> </w:t>
+      </w:r>
+      <w:r>
+        <w:t xml:space="preserve">accession, tissue, platform, sample number and role of each. two accessions are the two tissues of a single study</w:t>
       </w:r>
       <w:r>
         <w:t xml:space="preserve"> </w:t>
@@ -1225,19 +1213,13 @@
         <w:t xml:space="preserve"> </w:t>
       </w:r>
       <w:r>
-        <w:t xml:space="preserve">comparable between platforms with different gene coverage. A sample whose clock genes sit near their cohort mean has an</w:t>
-      </w:r>
-      <w:r>
-        <w:t xml:space="preserve"> </w:t>
-      </w:r>
-      <w:r>
-        <w:t xml:space="preserve">amplitude near zero whatever its phase. Because the projection is taken at the sample’s own phase,</w:t>
-      </w:r>
-      <w:r>
-        <w:t xml:space="preserve"> </w:t>
-      </w:r>
-      <w:r>
-        <w:t xml:space="preserve">amplitude is independent of phase by construction.</w:t>
+        <w:t xml:space="preserve">comparable between platforms with different gene coverage. Because the projection is taken at the sample’s own phase, amplitude is independent of phase by</w:t>
+      </w:r>
+      <w:r>
+        <w:t xml:space="preserve"> </w:t>
+      </w:r>
+      <w:r>
+        <w:t xml:space="preserve">construction.</w:t>
       </w:r>
     </w:p>
     <w:p>
@@ -1333,25 +1315,13 @@
         <w:t xml:space="preserve"> </w:t>
       </w:r>
       <w:r>
-        <w:t xml:space="preserve">each clock gene on recorded sampling time with a 24-h period, taking the modulus of the</w:t>
-      </w:r>
-      <w:r>
-        <w:t xml:space="preserve"> </w:t>
-      </w:r>
-      <w:r>
-        <w:t xml:space="preserve">first-harmonic coefficients. Validation was leave-one-out at two levels: the retained sample was</w:t>
-      </w:r>
-      <w:r>
-        <w:t xml:space="preserve"> </w:t>
-      </w:r>
-      <w:r>
-        <w:t xml:space="preserve">excluded from the cosinor fit of its own donor, and the whole donor was excluded from the ordering</w:t>
-      </w:r>
-      <w:r>
-        <w:t xml:space="preserve"> </w:t>
-      </w:r>
-      <w:r>
-        <w:t xml:space="preserve">and from the template, so that nothing of the evaluated donor enters its own estimate</w:t>
+        <w:t xml:space="preserve">each clock gene on recorded sampling time with a 24-h period, taking the modulus of the first-harmonic coefficients. Validation was leave-one-out at two levels: the retained sample was</w:t>
+      </w:r>
+      <w:r>
+        <w:t xml:space="preserve"> </w:t>
+      </w:r>
+      <w:r>
+        <w:t xml:space="preserve">excluded from the cosinor fit of its own donor, and the whole donor from the ordering and the template</w:t>
       </w:r>
       <w:r>
         <w:t xml:space="preserve"> </w:t>
@@ -1387,13 +1357,7 @@
         <w:t xml:space="preserve"> </w:t>
       </w:r>
       <w:r>
-        <w:t xml:space="preserve">the quantity the analyses below require. Published phase inference was therefore used as a</w:t>
-      </w:r>
-      <w:r>
-        <w:t xml:space="preserve"> </w:t>
-      </w:r>
-      <w:r>
-        <w:t xml:space="preserve">concordance control. Taking</w:t>
+        <w:t xml:space="preserve">the quantity the analyses below require. Published phase inference was therefore used as a concordance control. Taking</w:t>
       </w:r>
       <w:r>
         <w:t xml:space="preserve"> </w:t>
@@ -1439,13 +1403,13 @@
         <w:t xml:space="preserve">adipose,i</w:t>
       </w:r>
       <w:r>
-        <w:t xml:space="preserve">))|, the concentration of the muscle-to-adipose phase difference across</w:t>
-      </w:r>
-      <w:r>
-        <w:t xml:space="preserve"> </w:t>
-      </w:r>
-      <w:r>
-        <w:t xml:space="preserve">donors, our estimator and CHIRAL both detect the coupling in the two cohorts with paired tissues</w:t>
+        <w:t xml:space="preserve">))|, the concentration of the muscle-to-adipose phase difference across donors, our estimator and</w:t>
+      </w:r>
+      <w:r>
+        <w:t xml:space="preserve"> </w:t>
+      </w:r>
+      <w:r>
+        <w:t xml:space="preserve">CHIRAL both detect the coupling in the two cohorts with paired tissues</w:t>
       </w:r>
       <w:r>
         <w:t xml:space="preserve"> </w:t>
@@ -1787,19 +1751,13 @@
         <w:t xml:space="preserve"> </w:t>
       </w:r>
       <w:r>
-        <w:t xml:space="preserve">platform coverage. Collections were tested against a continuous ranking of all genes by their</w:t>
-      </w:r>
-      <w:r>
-        <w:t xml:space="preserve"> </w:t>
-      </w:r>
-      <w:r>
-        <w:t xml:space="preserve">partial correlation with receptor level, rather than against a list of significant genes, so no</w:t>
-      </w:r>
-      <w:r>
-        <w:t xml:space="preserve"> </w:t>
-      </w:r>
-      <w:r>
-        <w:t xml:space="preserve">significance threshold enters the enrichment (Supplementary Tables S4 and S12).</w:t>
+        <w:t xml:space="preserve">platform coverage. Collections were tested against a continuous ranking of all genes by their partial correlation</w:t>
+      </w:r>
+      <w:r>
+        <w:t xml:space="preserve"> </w:t>
+      </w:r>
+      <w:r>
+        <w:t xml:space="preserve">with receptor level, so no significance threshold enters the enrichment (Supplementary Tables S4 and S12).</w:t>
       </w:r>
     </w:p>
     <w:p>
@@ -2627,19 +2585,45 @@
         <w:t xml:space="preserve"> </w:t>
       </w:r>
       <w:r>
-        <w:t xml:space="preserve">ρ = 0.82 (P = 1.1 × 10⁻⁵, 20 series; Fig. 1g). Phase transferred between tissues: a template built</w:t>
-      </w:r>
-      <w:r>
-        <w:t xml:space="preserve"> </w:t>
-      </w:r>
-      <w:r>
-        <w:t xml:space="preserve">in muscle predicted the recorded sampling time of adipose tissue under constant routine (GSE87761)</w:t>
-      </w:r>
-      <w:r>
-        <w:t xml:space="preserve"> </w:t>
-      </w:r>
-      <w:r>
-        <w:t xml:space="preserve">to within 1.7 h (Supplementary Fig. S2 and Supplementary Table S5).</w:t>
+        <w:t xml:space="preserve">ρ = 0.82 (P = 1.1 × 10⁻⁵, 20 series; Fig. 1g). A template built in muscle predicted the recorded sampling</w:t>
+      </w:r>
+      <w:r>
+        <w:t xml:space="preserve"> </w:t>
+      </w:r>
+      <w:r>
+        <w:t xml:space="preserve">time of adipose tissue under constant routine (GSE87761) to within 1.7 h (Supplementary Fig. S2 and</w:t>
+      </w:r>
+      <w:r>
+        <w:t xml:space="preserve"> </w:t>
+      </w:r>
+      <w:r>
+        <w:t xml:space="preserve">Supplementary Table S5).</w:t>
+      </w:r>
+    </w:p>
+    <w:p>
+      <w:pPr>
+        <w:pStyle w:val="BodyText"/>
+      </w:pPr>
+      <w:r>
+        <w:t xml:space="preserve">Inferred amplitude also reproduces an externally published effect: in a controlled 10-h delay of</w:t>
+      </w:r>
+      <w:r>
+        <w:t xml:space="preserve"> </w:t>
+      </w:r>
+      <w:r>
+        <w:t xml:space="preserve">the habitual sleep period (GSE107537), it fell in all eight participants, by a median of 29%</w:t>
+      </w:r>
+      <w:r>
+        <w:t xml:space="preserve"> </w:t>
+      </w:r>
+      <w:r>
+        <w:t xml:space="preserve">(P = 0.008), while phase moved by 0.6 h — the published finding for that cohort is dampened rhythms</w:t>
+      </w:r>
+      <w:r>
+        <w:t xml:space="preserve"> </w:t>
+      </w:r>
+      <w:r>
+        <w:t xml:space="preserve">at a phase that follows habitual bedtime rather than the shifted schedule.</w:t>
       </w:r>
     </w:p>
     <w:p>

</xml_diff>